<commit_message>
Sprint 6: registra a correção do menu no celular (antes e depois)
</commit_message>
<xml_diff>
--- a/sprints/sprint-6/BuscaPet-Sprint6.docx
+++ b/sprints/sprint-6/BuscaPet-Sprint6.docx
@@ -4242,6 +4242,101 @@
                 <w:sz w:val="19"/>
                 <w:szCs w:val="19"/>
               </w:rPr>
+              <w:t xml:space="preserve">Menu do celular sem rolagem lateral</w:t>
+            </w:r>
+          </w:p>
+        </w:tc>
+        <w:tc>
+          <w:tcPr>
+            <w:tcW w:type="dxa" w:w="2155"/>
+            <w:tcBorders>
+              <w:top w:val="single" w:color="BFBFBF" w:sz="4"/>
+              <w:left w:val="single" w:color="BFBFBF" w:sz="4"/>
+              <w:bottom w:val="single" w:color="BFBFBF" w:sz="4"/>
+              <w:right w:val="single" w:color="BFBFBF" w:sz="4"/>
+            </w:tcBorders>
+            <w:tcMar>
+              <w:top w:type="dxa" w:w="60"/>
+              <w:left w:type="dxa" w:w="100"/>
+              <w:bottom w:type="dxa" w:w="60"/>
+              <w:right w:type="dxa" w:w="100"/>
+            </w:tcMar>
+            <w:vAlign w:val="center"/>
+          </w:tcPr>
+          <w:p>
+            <w:pPr>
+              <w:spacing w:after="0"/>
+            </w:pPr>
+            <w:r>
+              <w:rPr>
+                <w:sz w:val="19"/>
+                <w:szCs w:val="19"/>
+              </w:rPr>
+              <w:t xml:space="preserve">Cabeçalho (celular)</w:t>
+            </w:r>
+          </w:p>
+        </w:tc>
+        <w:tc>
+          <w:tcPr>
+            <w:tcW w:type="dxa" w:w="4082"/>
+            <w:tcBorders>
+              <w:top w:val="single" w:color="BFBFBF" w:sz="4"/>
+              <w:left w:val="single" w:color="BFBFBF" w:sz="4"/>
+              <w:bottom w:val="single" w:color="BFBFBF" w:sz="4"/>
+              <w:right w:val="single" w:color="BFBFBF" w:sz="4"/>
+            </w:tcBorders>
+            <w:tcMar>
+              <w:top w:type="dxa" w:w="60"/>
+              <w:left w:type="dxa" w:w="100"/>
+              <w:bottom w:type="dxa" w:w="60"/>
+              <w:right w:type="dxa" w:w="100"/>
+            </w:tcMar>
+            <w:vAlign w:val="center"/>
+          </w:tcPr>
+          <w:p>
+            <w:pPr>
+              <w:spacing w:after="0"/>
+            </w:pPr>
+            <w:r>
+              <w:rPr>
+                <w:sz w:val="19"/>
+                <w:szCs w:val="19"/>
+              </w:rPr>
+              <w:t xml:space="preserve">Os quatro itens em colunas iguais, todos visíveis (antes o último ficava escondido).</w:t>
+            </w:r>
+          </w:p>
+        </w:tc>
+      </w:tr>
+      <w:tr>
+        <w:trPr>
+          <w:cantSplit/>
+        </w:trPr>
+        <w:tc>
+          <w:tcPr>
+            <w:tcW w:type="dxa" w:w="3402"/>
+            <w:tcBorders>
+              <w:top w:val="single" w:color="BFBFBF" w:sz="4"/>
+              <w:left w:val="single" w:color="BFBFBF" w:sz="4"/>
+              <w:bottom w:val="single" w:color="BFBFBF" w:sz="4"/>
+              <w:right w:val="single" w:color="BFBFBF" w:sz="4"/>
+            </w:tcBorders>
+            <w:tcMar>
+              <w:top w:type="dxa" w:w="60"/>
+              <w:left w:type="dxa" w:w="100"/>
+              <w:bottom w:type="dxa" w:w="60"/>
+              <w:right w:type="dxa" w:w="100"/>
+            </w:tcMar>
+            <w:vAlign w:val="center"/>
+          </w:tcPr>
+          <w:p>
+            <w:pPr>
+              <w:spacing w:after="0"/>
+            </w:pPr>
+            <w:r>
+              <w:rPr>
+                <w:sz w:val="19"/>
+                <w:szCs w:val="19"/>
+              </w:rPr>
               <w:t xml:space="preserve">"Ver abrigo" no mapa abre o perfil público</w:t>
             </w:r>
           </w:p>
@@ -4961,10 +5056,10 @@
         <w:rPr>
           <w:b/>
         </w:rPr>
-        <w:t>Ajuste pendente:</w:t>
-      </w:r>
-      <w:r>
-        <w:t xml:space="preserve"> no celular, o menu principal continua rolando na horizontal (como desde a Sprint 3) e, com o quarto item, "Quem apoia" fica no fim da rolagem. A revisão do cabeçalho móvel entra na próxima Sprint.</w:t>
+        <w:t>Menu principal no celular.</w:t>
+      </w:r>
+      <w:r>
+        <w:t xml:space="preserve"> Desde a Sprint 3 o menu do celular era uma faixa que rolava para o lado. Com o quarto item, "Quem apoia" ficava fora da tela e passava despercebido. Agora os itens dividem a largura em colunas iguais (o texto quebra em duas linhas se precisar) e todos aparecem sem rolar. Um teste de ponta a ponta no celular confere que os quatro itens cabem na tela.</w:t>
       </w:r>
     </w:p>
     <w:p>
@@ -4976,7 +5071,7 @@
       <w:r>
         <w:drawing>
           <wp:inline xmlns:a="http://schemas.openxmlformats.org/drawingml/2006/main" xmlns:pic="http://schemas.openxmlformats.org/drawingml/2006/picture">
-            <wp:extent cx="2520000" cy="5453538"/>
+            <wp:extent cx="3240000" cy="2575385"/>
             <wp:docPr id="19" name="Picture 19"/>
             <wp:cNvGraphicFramePr>
               <a:graphicFrameLocks noChangeAspect="1"/>
@@ -4985,7 +5080,7 @@
               <a:graphicData uri="http://schemas.openxmlformats.org/drawingml/2006/picture">
                 <pic:pic>
                   <pic:nvPicPr>
-                    <pic:cNvPr id="0" name="s18-celular-quem-apoia.png"/>
+                    <pic:cNvPr id="0" name="s18-celular-menu-antes.png"/>
                     <pic:cNvPicPr/>
                   </pic:nvPicPr>
                   <pic:blipFill>
@@ -4997,7 +5092,7 @@
                   <pic:spPr>
                     <a:xfrm>
                       <a:off x="0" y="0"/>
-                      <a:ext cx="2520000" cy="5453538"/>
+                      <a:ext cx="3240000" cy="2575385"/>
                     </a:xfrm>
                     <a:prstGeom prst="rect"/>
                   </pic:spPr>
@@ -5019,7 +5114,62 @@
           <w:color w:val="595959"/>
           <w:sz w:val="18"/>
         </w:rPr>
-        <w:t>Figura 19 — Quem apoia no celular (390 px): o menu rola na horizontal</w:t>
+        <w:t>Figura 19 — Antes: no celular (390 px), o menu rolava e "Quem apoia" ficava cortado</w:t>
+      </w:r>
+    </w:p>
+    <w:p>
+      <w:pPr>
+        <w:keepNext/>
+        <w:spacing w:after="40" w:before="120"/>
+        <w:jc w:val="center"/>
+      </w:pPr>
+      <w:r>
+        <w:drawing>
+          <wp:inline xmlns:a="http://schemas.openxmlformats.org/drawingml/2006/main" xmlns:pic="http://schemas.openxmlformats.org/drawingml/2006/picture">
+            <wp:extent cx="3240000" cy="2575385"/>
+            <wp:docPr id="20" name="Picture 20"/>
+            <wp:cNvGraphicFramePr>
+              <a:graphicFrameLocks noChangeAspect="1"/>
+            </wp:cNvGraphicFramePr>
+            <a:graphic>
+              <a:graphicData uri="http://schemas.openxmlformats.org/drawingml/2006/picture">
+                <pic:pic>
+                  <pic:nvPicPr>
+                    <pic:cNvPr id="0" name="s19-celular-menu-depois.png"/>
+                    <pic:cNvPicPr/>
+                  </pic:nvPicPr>
+                  <pic:blipFill>
+                    <a:blip r:embed="rId26"/>
+                    <a:stretch>
+                      <a:fillRect/>
+                    </a:stretch>
+                  </pic:blipFill>
+                  <pic:spPr>
+                    <a:xfrm>
+                      <a:off x="0" y="0"/>
+                      <a:ext cx="3240000" cy="2575385"/>
+                    </a:xfrm>
+                    <a:prstGeom prst="rect"/>
+                  </pic:spPr>
+                </pic:pic>
+              </a:graphicData>
+            </a:graphic>
+          </wp:inline>
+        </w:drawing>
+      </w:r>
+    </w:p>
+    <w:p>
+      <w:pPr>
+        <w:spacing w:after="200"/>
+        <w:jc w:val="center"/>
+      </w:pPr>
+      <w:r>
+        <w:rPr>
+          <w:i/>
+          <w:color w:val="595959"/>
+          <w:sz w:val="18"/>
+        </w:rPr>
+        <w:t>Figura 20 — Depois: os quatro itens do menu à vista no celular</w:t>
       </w:r>
     </w:p>
     <w:p>
@@ -6486,7 +6636,7 @@
         <w:t>Bugs encontrados e corrigidos nesta Sprint:</w:t>
       </w:r>
       <w:r>
-        <w:t xml:space="preserve"> o teste do fluxo completo achou que a notificação de "selo concedido" se misturava à de doação nos testes (corrigido no teste, filtrando pelo tipo); e a revisão das capturas achou a etiqueta "Pode esperar" quebrando em duas linhas (corrigido no CSS).</w:t>
+        <w:t xml:space="preserve"> o teste do fluxo completo achou que a notificação de "selo concedido" se misturava à de doação nos testes (corrigido no teste, filtrando pelo tipo); e a revisão das capturas achou a etiqueta "Pode esperar" quebrando em duas linhas (corrigido no CSS). Na revisão das telas com o integrante responsável, o menu do celular escondendo o "Quem apoia" foi corrigido antes da entrega (seção 6).</w:t>
       </w:r>
     </w:p>
     <w:p>
@@ -7023,6 +7173,73 @@
           </w:p>
         </w:tc>
       </w:tr>
+      <w:tr>
+        <w:trPr>
+          <w:cantSplit/>
+        </w:trPr>
+        <w:tc>
+          <w:tcPr>
+            <w:tcW w:type="dxa" w:w="1701"/>
+            <w:tcBorders>
+              <w:top w:val="single" w:color="BFBFBF" w:sz="4"/>
+              <w:left w:val="single" w:color="BFBFBF" w:sz="4"/>
+              <w:bottom w:val="single" w:color="BFBFBF" w:sz="4"/>
+              <w:right w:val="single" w:color="BFBFBF" w:sz="4"/>
+            </w:tcBorders>
+            <w:tcMar>
+              <w:top w:type="dxa" w:w="60"/>
+              <w:left w:type="dxa" w:w="100"/>
+              <w:bottom w:type="dxa" w:w="60"/>
+              <w:right w:type="dxa" w:w="100"/>
+            </w:tcMar>
+            <w:vAlign w:val="center"/>
+          </w:tcPr>
+          <w:p>
+            <w:pPr>
+              <w:spacing w:after="0"/>
+            </w:pPr>
+            <w:r>
+              <w:rPr>
+                <w:rFonts w:ascii="Consolas" w:hAnsi="Consolas" w:cs="Consolas"/>
+                <w:sz w:val="17"/>
+                <w:szCs w:val="17"/>
+                <w:b/>
+              </w:rPr>
+              <w:t xml:space="preserve">44e0173</w:t>
+            </w:r>
+          </w:p>
+        </w:tc>
+        <w:tc>
+          <w:tcPr>
+            <w:tcW w:type="dxa" w:w="7938"/>
+            <w:tcBorders>
+              <w:top w:val="single" w:color="BFBFBF" w:sz="4"/>
+              <w:left w:val="single" w:color="BFBFBF" w:sz="4"/>
+              <w:bottom w:val="single" w:color="BFBFBF" w:sz="4"/>
+              <w:right w:val="single" w:color="BFBFBF" w:sz="4"/>
+            </w:tcBorders>
+            <w:tcMar>
+              <w:top w:type="dxa" w:w="60"/>
+              <w:left w:type="dxa" w:w="100"/>
+              <w:bottom w:type="dxa" w:w="60"/>
+              <w:right w:type="dxa" w:w="100"/>
+            </w:tcMar>
+            <w:vAlign w:val="center"/>
+          </w:tcPr>
+          <w:p>
+            <w:pPr>
+              <w:spacing w:after="0"/>
+            </w:pPr>
+            <w:r>
+              <w:rPr>
+                <w:sz w:val="19"/>
+                <w:szCs w:val="19"/>
+              </w:rPr>
+              <w:t xml:space="preserve">Menu principal do celular com todos os itens à vista</w:t>
+            </w:r>
+          </w:p>
+        </w:tc>
+      </w:tr>
     </w:tbl>
     <w:p>
       <w:pPr>
@@ -7544,6 +7761,15 @@
     </w:p>
     <w:p>
       <w:pPr>
+        <w:pStyle w:val="Heading2"/>
+        <w:keepNext/>
+      </w:pPr>
+      <w:r>
+        <w:t>11.2 Próximos passos</w:t>
+      </w:r>
+    </w:p>
+    <w:p>
+      <w:pPr>
         <w:pStyle w:val="ListParagraph"/>
         <w:numPr>
           <w:ilvl w:val="0"/>
@@ -7555,19 +7781,10 @@
         <w:rPr>
           <w:b/>
         </w:rPr>
-        <w:t>Menu principal no celular</w:t>
-      </w:r>
-      <w:r>
-        <w:t xml:space="preserve"> rola na horizontal e esconde o último item (seção 6).</w:t>
-      </w:r>
-    </w:p>
-    <w:p>
-      <w:pPr>
-        <w:pStyle w:val="Heading2"/>
-        <w:keepNext/>
-      </w:pPr>
-      <w:r>
-        <w:t>11.2 Próximos passos</w:t>
+        <w:t>Sprint 7 (sistema quase completo):</w:t>
+      </w:r>
+      <w:r>
+        <w:t xml:space="preserve"> painel da administração com indicadores, relatórios do abrigo e da administração (adoções, doações recebidas) com exportação, filtros e registro de ações (logs de auditoria).</w:t>
       </w:r>
     </w:p>
     <w:p>
@@ -7580,13 +7797,7 @@
         <w:spacing w:after="60" w:line="276" w:lineRule="auto"/>
       </w:pPr>
       <w:r>
-        <w:rPr>
-          <w:b/>
-        </w:rPr>
-        <w:t>Sprint 7 (sistema quase completo):</w:t>
-      </w:r>
-      <w:r>
-        <w:t xml:space="preserve"> painel da administração com indicadores, relatórios do abrigo e da administração (adoções, doações recebidas) com exportação, filtros e registro de ações (logs de auditoria).</w:t>
+        <w:t>Registro das observações da Pré-Banca quando ela acontecer.</w:t>
       </w:r>
     </w:p>
     <w:p>
@@ -7599,24 +7810,11 @@
         <w:spacing w:after="60" w:line="276" w:lineRule="auto"/>
       </w:pPr>
       <w:r>
-        <w:t>Revisão do cabeçalho no celular e registro das observações da Pré-Banca quando ela acontecer.</w:t>
-      </w:r>
-    </w:p>
-    <w:p>
-      <w:pPr>
-        <w:pStyle w:val="ListParagraph"/>
-        <w:numPr>
-          <w:ilvl w:val="0"/>
-          <w:numId w:val="2"/>
-        </w:numPr>
-        <w:spacing w:after="60" w:line="276" w:lineRule="auto"/>
-      </w:pPr>
-      <w:r>
         <w:t>Núcleo OpenCL (comparação por foto) em paralelo às Sprints oficiais.</w:t>
       </w:r>
     </w:p>
     <w:sectPr>
-      <w:footerReference w:type="default" r:id="rId26"/>
+      <w:footerReference w:type="default" r:id="rId27"/>
       <w:pgSz w:w="11906" w:h="16838" w:orient="portrait"/>
       <w:pgMar w:top="1134" w:right="1134" w:bottom="1134" w:left="1134" w:header="708" w:footer="708" w:gutter="0"/>
       <w:pgNumType/>

</xml_diff>